<commit_message>
Updated resume for the upteenth time
</commit_message>
<xml_diff>
--- a/public/resume.docx
+++ b/public/resume.docx
@@ -5,7 +5,6 @@
     <w:p>
       <w:pPr>
         <w:spacing w:after="20"/>
-        <w:jc w:val="left"/>
       </w:pPr>
       <w:r>
         <w:rPr>
@@ -32,14 +31,14 @@
           <w:sz w:val="20"/>
           <w:szCs w:val="20"/>
         </w:rPr>
-        <w:t xml:space="preserve">Technical Writer | Content Writer | SEO Writer | Product Copywriter | Web2 and Web3</w:t>
+        <w:t xml:space="preserve">SEO/GEO/AEO Specialist | Content Writer | Technical Writer | Web2 and Web3</w:t>
       </w:r>
     </w:p>
     <w:p>
       <w:pPr>
         <w:spacing w:after="20"/>
       </w:pPr>
-      <w:hyperlink w:history="1" r:id="rId_ibtwi4htlzwo2uyhpd-o">
+      <w:hyperlink w:history="1" r:id="rIdily-hnjox6-nwt6can7aq">
         <w:r>
           <w:rPr>
             <w:rFonts w:ascii="Calibri" w:cs="Calibri" w:eastAsia="Calibri" w:hAnsi="Calibri"/>
@@ -60,7 +59,7 @@
         </w:rPr>
         <w:t xml:space="preserve">  ·  </w:t>
       </w:r>
-      <w:hyperlink w:history="1" r:id="rIdhilxxegs8xzhhwbgdiitp">
+      <w:hyperlink w:history="1" r:id="rIdnjwfepb38jeqewkhrl1ea">
         <w:r>
           <w:rPr>
             <w:rFonts w:ascii="Calibri" w:cs="Calibri" w:eastAsia="Calibri" w:hAnsi="Calibri"/>
@@ -81,7 +80,7 @@
         </w:rPr>
         <w:t xml:space="preserve">  ·  </w:t>
       </w:r>
-      <w:hyperlink w:history="1" r:id="rIdlv9bwgzg_hvtlffntlldx">
+      <w:hyperlink w:history="1" r:id="rIdfxrtjqgvsoubow3z9kywe">
         <w:r>
           <w:rPr>
             <w:rFonts w:ascii="Calibri" w:cs="Calibri" w:eastAsia="Calibri" w:hAnsi="Calibri"/>
@@ -102,7 +101,7 @@
         </w:rPr>
         <w:t xml:space="preserve">  ·  </w:t>
       </w:r>
-      <w:hyperlink w:history="1" r:id="rIdazag10kp5-enuecsvnplb">
+      <w:hyperlink w:history="1" r:id="rIdw0eogejaty1n_1zx0ne6r">
         <w:r>
           <w:rPr>
             <w:rFonts w:ascii="Calibri" w:cs="Calibri" w:eastAsia="Calibri" w:hAnsi="Calibri"/>
@@ -123,7 +122,7 @@
         </w:rPr>
         <w:t xml:space="preserve">  ·  </w:t>
       </w:r>
-      <w:hyperlink w:history="1" r:id="rIdxu82ouxlkkv_oxfzu2pae">
+      <w:hyperlink w:history="1" r:id="rIdq69ekflkogkzp1cmykbys">
         <w:r>
           <w:rPr>
             <w:rFonts w:ascii="Calibri" w:cs="Calibri" w:eastAsia="Calibri" w:hAnsi="Calibri"/>
@@ -140,7 +139,7 @@
       <w:pPr>
         <w:spacing w:after="80"/>
       </w:pPr>
-      <w:hyperlink w:history="1" r:id="rIdgbgerv0mon09g2qidjhzv">
+      <w:hyperlink w:history="1" r:id="rIdfawts-13xn2_i-67cxqcg">
         <w:r>
           <w:rPr>
             <w:rFonts w:ascii="Calibri" w:cs="Calibri" w:eastAsia="Calibri" w:hAnsi="Calibri"/>
@@ -166,7 +165,7 @@
         <w:pBdr>
           <w:bottom w:val="single" w:color="1F3864" w:sz="4" w:space="2"/>
         </w:pBdr>
-        <w:spacing w:after="60" w:before="220"/>
+        <w:spacing w:after="60" w:before="200"/>
       </w:pPr>
       <w:r>
         <w:rPr>
@@ -191,7 +190,7 @@
           <w:sz w:val="20"/>
           <w:szCs w:val="20"/>
         </w:rPr>
-        <w:t xml:space="preserve">I help Web2 and Web3 products turn complex ideas into content that ranks, explains, and converts. My background spans frontend, backend, APIs, and blockchain (JavaScript, TypeScript, Python, Solidity, smart contracts, DeFi), which lets me understand a product at the code level before writing about it for any audience — developers, technical teams, or first-time users. Work is grounded in primary-source verification: claims get checked before they're published, not asserted on the strength of fluent prose. That range now spans developer documentation, live product copy for consumer brands, and research-driven company breakdowns.</w:t>
+        <w:t xml:space="preserve">I help brands get found by search engines and AI answer engines — fixing the technical groundwork most sites get wrong, then writing the content that earns visibility once it's fixable. That's backed by a software engineering background and ongoing Computer Science study, giving me the depth to write about technical and web3 products the way someone who's actually built them would. Recent proof: took my own site from a 33% Ahrefs health score and zero Google indexing to 100% health and a Google AI Overview citation in 72 hours.</w:t>
       </w:r>
     </w:p>
     <w:p>
@@ -199,7 +198,7 @@
         <w:pBdr>
           <w:bottom w:val="single" w:color="1F3864" w:sz="4" w:space="2"/>
         </w:pBdr>
-        <w:spacing w:after="60" w:before="220"/>
+        <w:spacing w:after="60" w:before="200"/>
       </w:pPr>
       <w:r>
         <w:rPr>
@@ -220,7 +219,67 @@
           <w:ilvl w:val="0"/>
           <w:numId w:val="2"/>
         </w:numPr>
-        <w:spacing w:after="60"/>
+        <w:spacing w:after="55"/>
+      </w:pPr>
+      <w:r>
+        <w:rPr>
+          <w:rFonts w:ascii="Calibri" w:cs="Calibri" w:eastAsia="Calibri" w:hAnsi="Calibri"/>
+          <w:b/>
+          <w:bCs/>
+          <w:color w:val="333333"/>
+          <w:sz w:val="20"/>
+          <w:szCs w:val="20"/>
+        </w:rPr>
+        <w:t xml:space="preserve">SEO / GEO / AEO: </w:t>
+      </w:r>
+      <w:r>
+        <w:rPr>
+          <w:rFonts w:ascii="Calibri" w:cs="Calibri" w:eastAsia="Calibri" w:hAnsi="Calibri"/>
+          <w:color w:val="333333"/>
+          <w:sz w:val="20"/>
+          <w:szCs w:val="20"/>
+        </w:rPr>
+        <w:t xml:space="preserve">Keyword research and content strategy across search, AEO, and GEO; on-page SEO (metadata, headers, internal linking); technical SEO (schema, canonicals, redirects, Open Graph); off-page SEO and backlink strategy; analytics and reporting via GA, GSC, and GTM</w:t>
+      </w:r>
+    </w:p>
+    <w:p>
+      <w:pPr>
+        <w:pStyle w:val="ListParagraph"/>
+        <w:numPr>
+          <w:ilvl w:val="0"/>
+          <w:numId w:val="2"/>
+        </w:numPr>
+        <w:spacing w:after="55"/>
+      </w:pPr>
+      <w:r>
+        <w:rPr>
+          <w:rFonts w:ascii="Calibri" w:cs="Calibri" w:eastAsia="Calibri" w:hAnsi="Calibri"/>
+          <w:b/>
+          <w:bCs/>
+          <w:color w:val="333333"/>
+          <w:sz w:val="20"/>
+          <w:szCs w:val="20"/>
+        </w:rPr>
+        <w:t xml:space="preserve">Content Writing: </w:t>
+      </w:r>
+      <w:r>
+        <w:rPr>
+          <w:rFonts w:ascii="Calibri" w:cs="Calibri" w:eastAsia="Calibri" w:hAnsi="Calibri"/>
+          <w:color w:val="333333"/>
+          <w:sz w:val="20"/>
+          <w:szCs w:val="20"/>
+        </w:rPr>
+        <w:t xml:space="preserve">Research-backed blog posts and long-form articles across tech, finance, and web3 — sources verified and compared before writing</w:t>
+      </w:r>
+    </w:p>
+    <w:p>
+      <w:pPr>
+        <w:pStyle w:val="ListParagraph"/>
+        <w:numPr>
+          <w:ilvl w:val="0"/>
+          <w:numId w:val="2"/>
+        </w:numPr>
+        <w:spacing w:after="55"/>
       </w:pPr>
       <w:r>
         <w:rPr>
@@ -240,97 +299,7 @@
           <w:sz w:val="20"/>
           <w:szCs w:val="20"/>
         </w:rPr>
-        <w:t xml:space="preserve">Documentation, API docs, developer guides, whitepapers</w:t>
-      </w:r>
-    </w:p>
-    <w:p>
-      <w:pPr>
-        <w:pStyle w:val="ListParagraph"/>
-        <w:numPr>
-          <w:ilvl w:val="0"/>
-          <w:numId w:val="2"/>
-        </w:numPr>
-        <w:spacing w:after="60"/>
-      </w:pPr>
-      <w:r>
-        <w:rPr>
-          <w:rFonts w:ascii="Calibri" w:cs="Calibri" w:eastAsia="Calibri" w:hAnsi="Calibri"/>
-          <w:b/>
-          <w:bCs/>
-          <w:color w:val="333333"/>
-          <w:sz w:val="20"/>
-          <w:szCs w:val="20"/>
-        </w:rPr>
-        <w:t xml:space="preserve">Content Writing: </w:t>
-      </w:r>
-      <w:r>
-        <w:rPr>
-          <w:rFonts w:ascii="Calibri" w:cs="Calibri" w:eastAsia="Calibri" w:hAnsi="Calibri"/>
-          <w:color w:val="333333"/>
-          <w:sz w:val="20"/>
-          <w:szCs w:val="20"/>
-        </w:rPr>
-        <w:t xml:space="preserve">Research-driven articles, explainers, thought leadership</w:t>
-      </w:r>
-    </w:p>
-    <w:p>
-      <w:pPr>
-        <w:pStyle w:val="ListParagraph"/>
-        <w:numPr>
-          <w:ilvl w:val="0"/>
-          <w:numId w:val="2"/>
-        </w:numPr>
-        <w:spacing w:after="60"/>
-      </w:pPr>
-      <w:r>
-        <w:rPr>
-          <w:rFonts w:ascii="Calibri" w:cs="Calibri" w:eastAsia="Calibri" w:hAnsi="Calibri"/>
-          <w:b/>
-          <w:bCs/>
-          <w:color w:val="333333"/>
-          <w:sz w:val="20"/>
-          <w:szCs w:val="20"/>
-        </w:rPr>
-        <w:t xml:space="preserve">SEO Writing: </w:t>
-      </w:r>
-      <w:r>
-        <w:rPr>
-          <w:rFonts w:ascii="Calibri" w:cs="Calibri" w:eastAsia="Calibri" w:hAnsi="Calibri"/>
-          <w:color w:val="333333"/>
-          <w:sz w:val="20"/>
-          <w:szCs w:val="20"/>
-        </w:rPr>
-        <w:t xml:space="preserve">Content that ranks on Google and Bing — site audits, keyword research, and on-page fixes using Search Console, Analytics, Ahrefs, SEMrush, and Ubersuggest</w:t>
-      </w:r>
-    </w:p>
-    <w:p>
-      <w:pPr>
-        <w:pStyle w:val="ListParagraph"/>
-        <w:numPr>
-          <w:ilvl w:val="0"/>
-          <w:numId w:val="2"/>
-        </w:numPr>
-        <w:spacing w:after="60"/>
-      </w:pPr>
-      <w:r>
-        <w:rPr>
-          <w:rFonts w:ascii="Calibri" w:cs="Calibri" w:eastAsia="Calibri" w:hAnsi="Calibri"/>
-          <w:b/>
-          <w:bCs/>
-          <w:color w:val="333333"/>
-          <w:sz w:val="20"/>
-          <w:szCs w:val="20"/>
-        </w:rPr>
-        <w:t xml:space="preserve">Product Copywriting: </w:t>
-      </w:r>
-      <w:r>
-        <w:rPr>
-          <w:rFonts w:ascii="Calibri" w:cs="Calibri" w:eastAsia="Calibri" w:hAnsi="Calibri"/>
-          <w:color w:val="333333"/>
-          <w:sz w:val="20"/>
-          <w:szCs w:val="20"/>
-        </w:rPr>
-        <w:t xml:space="preserve">Landing pages, product pages, UX copy that drives action</w:t>
+        <w:t xml:space="preserve">Developer docs, protocol explainers, and product copy, written docs-as-code — version-controlled, reviewed, shipped like code</w:t>
       </w:r>
     </w:p>
     <w:p>
@@ -338,7 +307,7 @@
         <w:pBdr>
           <w:bottom w:val="single" w:color="1F3864" w:sz="4" w:space="2"/>
         </w:pBdr>
-        <w:spacing w:after="60" w:before="220"/>
+        <w:spacing w:after="60" w:before="200"/>
       </w:pPr>
       <w:r>
         <w:rPr>
@@ -349,187 +318,21 @@
           <w:sz w:val="21"/>
           <w:szCs w:val="21"/>
         </w:rPr>
-        <w:t xml:space="preserve">TECHNICAL SKILLS</w:t>
-      </w:r>
-    </w:p>
-    <w:p>
-      <w:pPr>
-        <w:pStyle w:val="ListParagraph"/>
-        <w:numPr>
-          <w:ilvl w:val="0"/>
-          <w:numId w:val="2"/>
-        </w:numPr>
-        <w:spacing w:after="60"/>
-      </w:pPr>
-      <w:r>
-        <w:rPr>
-          <w:rFonts w:ascii="Calibri" w:cs="Calibri" w:eastAsia="Calibri" w:hAnsi="Calibri"/>
-          <w:b/>
-          <w:bCs/>
-          <w:color w:val="333333"/>
-          <w:sz w:val="20"/>
-          <w:szCs w:val="20"/>
-        </w:rPr>
-        <w:t xml:space="preserve">Languages: </w:t>
-      </w:r>
-      <w:r>
-        <w:rPr>
-          <w:rFonts w:ascii="Calibri" w:cs="Calibri" w:eastAsia="Calibri" w:hAnsi="Calibri"/>
-          <w:color w:val="333333"/>
-          <w:sz w:val="20"/>
-          <w:szCs w:val="20"/>
-        </w:rPr>
-        <w:t xml:space="preserve">JavaScript, TypeScript, Python, Solidity</w:t>
-      </w:r>
-    </w:p>
-    <w:p>
-      <w:pPr>
-        <w:pStyle w:val="ListParagraph"/>
-        <w:numPr>
-          <w:ilvl w:val="0"/>
-          <w:numId w:val="2"/>
-        </w:numPr>
-        <w:spacing w:after="60"/>
-      </w:pPr>
-      <w:r>
-        <w:rPr>
-          <w:rFonts w:ascii="Calibri" w:cs="Calibri" w:eastAsia="Calibri" w:hAnsi="Calibri"/>
-          <w:b/>
-          <w:bCs/>
-          <w:color w:val="333333"/>
-          <w:sz w:val="20"/>
-          <w:szCs w:val="20"/>
-        </w:rPr>
-        <w:t xml:space="preserve">Stack: </w:t>
-      </w:r>
-      <w:r>
-        <w:rPr>
-          <w:rFonts w:ascii="Calibri" w:cs="Calibri" w:eastAsia="Calibri" w:hAnsi="Calibri"/>
-          <w:color w:val="333333"/>
-          <w:sz w:val="20"/>
-          <w:szCs w:val="20"/>
-        </w:rPr>
-        <w:t xml:space="preserve">Next.js, Node.js, Express, REST APIs, Prisma ORM, PostgreSQL, Supabase</w:t>
-      </w:r>
-    </w:p>
-    <w:p>
-      <w:pPr>
-        <w:pStyle w:val="ListParagraph"/>
-        <w:numPr>
-          <w:ilvl w:val="0"/>
-          <w:numId w:val="2"/>
-        </w:numPr>
-        <w:spacing w:after="60"/>
-      </w:pPr>
-      <w:r>
-        <w:rPr>
-          <w:rFonts w:ascii="Calibri" w:cs="Calibri" w:eastAsia="Calibri" w:hAnsi="Calibri"/>
-          <w:b/>
-          <w:bCs/>
-          <w:color w:val="333333"/>
-          <w:sz w:val="20"/>
-          <w:szCs w:val="20"/>
-        </w:rPr>
-        <w:t xml:space="preserve">Blockchain: </w:t>
-      </w:r>
-      <w:r>
-        <w:rPr>
-          <w:rFonts w:ascii="Calibri" w:cs="Calibri" w:eastAsia="Calibri" w:hAnsi="Calibri"/>
-          <w:color w:val="333333"/>
-          <w:sz w:val="20"/>
-          <w:szCs w:val="20"/>
-        </w:rPr>
-        <w:t xml:space="preserve">Smart contracts, Ethereum, DeFi, ethers.js, Hardhat</w:t>
-      </w:r>
-    </w:p>
-    <w:p>
-      <w:pPr>
-        <w:pStyle w:val="ListParagraph"/>
-        <w:numPr>
-          <w:ilvl w:val="0"/>
-          <w:numId w:val="2"/>
-        </w:numPr>
-        <w:spacing w:after="60"/>
-      </w:pPr>
-      <w:r>
-        <w:rPr>
-          <w:rFonts w:ascii="Calibri" w:cs="Calibri" w:eastAsia="Calibri" w:hAnsi="Calibri"/>
-          <w:b/>
-          <w:bCs/>
-          <w:color w:val="333333"/>
-          <w:sz w:val="20"/>
-          <w:szCs w:val="20"/>
-        </w:rPr>
-        <w:t xml:space="preserve">Dev Tools: </w:t>
-      </w:r>
-      <w:r>
-        <w:rPr>
-          <w:rFonts w:ascii="Calibri" w:cs="Calibri" w:eastAsia="Calibri" w:hAnsi="Calibri"/>
-          <w:color w:val="333333"/>
-          <w:sz w:val="20"/>
-          <w:szCs w:val="20"/>
-        </w:rPr>
-        <w:t xml:space="preserve">Git, GitHub, Vercel, Markdown, docs-as-code workflows</w:t>
-      </w:r>
-    </w:p>
-    <w:p>
-      <w:pPr>
-        <w:pStyle w:val="ListParagraph"/>
-        <w:numPr>
-          <w:ilvl w:val="0"/>
-          <w:numId w:val="2"/>
-        </w:numPr>
-        <w:spacing w:after="60"/>
-      </w:pPr>
-      <w:r>
-        <w:rPr>
-          <w:rFonts w:ascii="Calibri" w:cs="Calibri" w:eastAsia="Calibri" w:hAnsi="Calibri"/>
-          <w:b/>
-          <w:bCs/>
-          <w:color w:val="333333"/>
-          <w:sz w:val="20"/>
-          <w:szCs w:val="20"/>
-        </w:rPr>
-        <w:t xml:space="preserve">SEO &amp; Analytics: </w:t>
-      </w:r>
-      <w:r>
-        <w:rPr>
-          <w:rFonts w:ascii="Calibri" w:cs="Calibri" w:eastAsia="Calibri" w:hAnsi="Calibri"/>
-          <w:color w:val="333333"/>
-          <w:sz w:val="20"/>
-          <w:szCs w:val="20"/>
-        </w:rPr>
-        <w:t xml:space="preserve">Google Search Console, Google Analytics, Ahrefs, SEMrush, Ubersuggest</w:t>
-      </w:r>
-    </w:p>
-    <w:p>
-      <w:pPr>
-        <w:pStyle w:val="ListParagraph"/>
-        <w:numPr>
-          <w:ilvl w:val="0"/>
-          <w:numId w:val="2"/>
-        </w:numPr>
-        <w:spacing w:after="60"/>
-      </w:pPr>
-      <w:r>
-        <w:rPr>
-          <w:rFonts w:ascii="Calibri" w:cs="Calibri" w:eastAsia="Calibri" w:hAnsi="Calibri"/>
-          <w:b/>
-          <w:bCs/>
-          <w:color w:val="333333"/>
-          <w:sz w:val="20"/>
-          <w:szCs w:val="20"/>
-        </w:rPr>
-        <w:t xml:space="preserve">Collaboration: </w:t>
-      </w:r>
-      <w:r>
-        <w:rPr>
-          <w:rFonts w:ascii="Calibri" w:cs="Calibri" w:eastAsia="Calibri" w:hAnsi="Calibri"/>
-          <w:color w:val="333333"/>
-          <w:sz w:val="20"/>
-          <w:szCs w:val="20"/>
-        </w:rPr>
-        <w:t xml:space="preserve">Google Docs, Slack, Notion</w:t>
+        <w:t xml:space="preserve">SKILLS</w:t>
+      </w:r>
+    </w:p>
+    <w:p>
+      <w:pPr>
+        <w:spacing w:after="100"/>
+      </w:pPr>
+      <w:r>
+        <w:rPr>
+          <w:rFonts w:ascii="Calibri" w:cs="Calibri" w:eastAsia="Calibri" w:hAnsi="Calibri"/>
+          <w:color w:val="333333"/>
+          <w:sz w:val="20"/>
+          <w:szCs w:val="20"/>
+        </w:rPr>
+        <w:t xml:space="preserve">SEO · GEO · AEO · Keyword Research · On-Page SEO · Off-Page SEO · SEO Content Writing · Content Optimization · Technical Writing</w:t>
       </w:r>
     </w:p>
     <w:p>
@@ -537,7 +340,7 @@
         <w:pBdr>
           <w:bottom w:val="single" w:color="1F3864" w:sz="4" w:space="2"/>
         </w:pBdr>
-        <w:spacing w:after="60" w:before="220"/>
+        <w:spacing w:after="60" w:before="200"/>
       </w:pPr>
       <w:r>
         <w:rPr>
@@ -548,99 +351,21 @@
           <w:sz w:val="21"/>
           <w:szCs w:val="21"/>
         </w:rPr>
-        <w:t xml:space="preserve">SELECTED PROJECTS</w:t>
-      </w:r>
-    </w:p>
-    <w:p>
-      <w:pPr>
-        <w:spacing w:after="20" w:before="100"/>
-      </w:pPr>
-      <w:r>
-        <w:rPr>
-          <w:rFonts w:ascii="Calibri" w:cs="Calibri" w:eastAsia="Calibri" w:hAnsi="Calibri"/>
-          <w:b/>
-          <w:bCs/>
-          <w:color w:val="333333"/>
-          <w:sz w:val="20"/>
-          <w:szCs w:val="20"/>
-        </w:rPr>
-        <w:t xml:space="preserve">Roomly — Student Accommodation Platform</w:t>
-      </w:r>
-      <w:r>
-        <w:rPr>
-          <w:rFonts w:ascii="Calibri" w:cs="Calibri" w:eastAsia="Calibri" w:hAnsi="Calibri"/>
-          <w:i/>
-          <w:iCs/>
-          <w:color w:val="555555"/>
-          <w:sz w:val="19"/>
-          <w:szCs w:val="19"/>
-        </w:rPr>
-        <w:t xml:space="preserve">  |  Next.js · TypeScript · Express · Prisma · Supabase · Paystack/Monnify</w:t>
-      </w:r>
-    </w:p>
-    <w:p>
-      <w:pPr>
-        <w:pStyle w:val="ListParagraph"/>
-        <w:numPr>
-          <w:ilvl w:val="0"/>
-          <w:numId w:val="2"/>
-        </w:numPr>
-        <w:spacing w:after="60"/>
-      </w:pPr>
-      <w:r>
-        <w:rPr>
-          <w:rFonts w:ascii="Calibri" w:cs="Calibri" w:eastAsia="Calibri" w:hAnsi="Calibri"/>
-          <w:color w:val="333333"/>
-          <w:sz w:val="20"/>
-          <w:szCs w:val="20"/>
-        </w:rPr>
-        <w:t xml:space="preserve">Founded and built a live multi-role SaaS platform for Nigerian university accommodation, owning product, design, engineering, and deployment — including an escrow-backed payment workflow.</w:t>
-      </w:r>
-    </w:p>
-    <w:p>
-      <w:pPr>
-        <w:spacing w:after="20" w:before="100"/>
-      </w:pPr>
-      <w:r>
-        <w:rPr>
-          <w:rFonts w:ascii="Calibri" w:cs="Calibri" w:eastAsia="Calibri" w:hAnsi="Calibri"/>
-          <w:b/>
-          <w:bCs/>
-          <w:color w:val="333333"/>
-          <w:sz w:val="20"/>
-          <w:szCs w:val="20"/>
-        </w:rPr>
-        <w:t xml:space="preserve">Smart Contract Development</w:t>
-      </w:r>
-      <w:r>
-        <w:rPr>
-          <w:rFonts w:ascii="Calibri" w:cs="Calibri" w:eastAsia="Calibri" w:hAnsi="Calibri"/>
-          <w:i/>
-          <w:iCs/>
-          <w:color w:val="555555"/>
-          <w:sz w:val="19"/>
-          <w:szCs w:val="19"/>
-        </w:rPr>
-        <w:t xml:space="preserve">  |  Solidity · ethers.js · Hardhat</w:t>
-      </w:r>
-    </w:p>
-    <w:p>
-      <w:pPr>
-        <w:pStyle w:val="ListParagraph"/>
-        <w:numPr>
-          <w:ilvl w:val="0"/>
-          <w:numId w:val="2"/>
-        </w:numPr>
-        <w:spacing w:after="60"/>
-      </w:pPr>
-      <w:r>
-        <w:rPr>
-          <w:rFonts w:ascii="Calibri" w:cs="Calibri" w:eastAsia="Calibri" w:hAnsi="Calibri"/>
-          <w:color w:val="333333"/>
-          <w:sz w:val="20"/>
-          <w:szCs w:val="20"/>
-        </w:rPr>
-        <w:t xml:space="preserve">Built and tested a flash-loan arbitrage smart contract on a mainnet fork before deploying to Ethereum mainnet — hands-on experience with AMM mechanics and on-chain contract interactions.</w:t>
+        <w:t xml:space="preserve">STACK</w:t>
+      </w:r>
+    </w:p>
+    <w:p>
+      <w:pPr>
+        <w:spacing w:after="100"/>
+      </w:pPr>
+      <w:r>
+        <w:rPr>
+          <w:rFonts w:ascii="Calibri" w:cs="Calibri" w:eastAsia="Calibri" w:hAnsi="Calibri"/>
+          <w:color w:val="333333"/>
+          <w:sz w:val="20"/>
+          <w:szCs w:val="20"/>
+        </w:rPr>
+        <w:t xml:space="preserve">Ahrefs · Ubersuggest · SEMrush · Google Analytics · Google Search Console · Google Tag Manager · Sanity CMS · Google Docs · Markdown · HTML/CSS/JS · Git · GitBook · ReadMe</w:t>
       </w:r>
     </w:p>
     <w:p>
@@ -648,7 +373,7 @@
         <w:pBdr>
           <w:bottom w:val="single" w:color="1F3864" w:sz="4" w:space="2"/>
         </w:pBdr>
-        <w:spacing w:after="60" w:before="220"/>
+        <w:spacing w:after="60" w:before="200"/>
       </w:pPr>
       <w:r>
         <w:rPr>
@@ -659,12 +384,110 @@
           <w:sz w:val="21"/>
           <w:szCs w:val="21"/>
         </w:rPr>
+        <w:t xml:space="preserve">SUPPORTING TECHNICAL BACKGROUND</w:t>
+      </w:r>
+    </w:p>
+    <w:p>
+      <w:pPr>
+        <w:pStyle w:val="ListParagraph"/>
+        <w:numPr>
+          <w:ilvl w:val="0"/>
+          <w:numId w:val="2"/>
+        </w:numPr>
+        <w:spacing w:after="55"/>
+      </w:pPr>
+      <w:r>
+        <w:rPr>
+          <w:rFonts w:ascii="Calibri" w:cs="Calibri" w:eastAsia="Calibri" w:hAnsi="Calibri"/>
+          <w:b/>
+          <w:bCs/>
+          <w:color w:val="333333"/>
+          <w:sz w:val="20"/>
+          <w:szCs w:val="20"/>
+        </w:rPr>
+        <w:t xml:space="preserve">Languages: </w:t>
+      </w:r>
+      <w:r>
+        <w:rPr>
+          <w:rFonts w:ascii="Calibri" w:cs="Calibri" w:eastAsia="Calibri" w:hAnsi="Calibri"/>
+          <w:color w:val="333333"/>
+          <w:sz w:val="20"/>
+          <w:szCs w:val="20"/>
+        </w:rPr>
+        <w:t xml:space="preserve">JavaScript, TypeScript, Python, Solidity</w:t>
+      </w:r>
+    </w:p>
+    <w:p>
+      <w:pPr>
+        <w:pStyle w:val="ListParagraph"/>
+        <w:numPr>
+          <w:ilvl w:val="0"/>
+          <w:numId w:val="2"/>
+        </w:numPr>
+        <w:spacing w:after="55"/>
+      </w:pPr>
+      <w:r>
+        <w:rPr>
+          <w:rFonts w:ascii="Calibri" w:cs="Calibri" w:eastAsia="Calibri" w:hAnsi="Calibri"/>
+          <w:b/>
+          <w:bCs/>
+          <w:color w:val="333333"/>
+          <w:sz w:val="20"/>
+          <w:szCs w:val="20"/>
+        </w:rPr>
+        <w:t xml:space="preserve">Blockchain: </w:t>
+      </w:r>
+      <w:r>
+        <w:rPr>
+          <w:rFonts w:ascii="Calibri" w:cs="Calibri" w:eastAsia="Calibri" w:hAnsi="Calibri"/>
+          <w:color w:val="333333"/>
+          <w:sz w:val="20"/>
+          <w:szCs w:val="20"/>
+        </w:rPr>
+        <w:t xml:space="preserve">Smart contracts, Ethereum, DeFi, ethers.js, Hardhat</w:t>
+      </w:r>
+    </w:p>
+    <w:p>
+      <w:pPr>
+        <w:pStyle w:val="ListParagraph"/>
+        <w:numPr>
+          <w:ilvl w:val="0"/>
+          <w:numId w:val="2"/>
+        </w:numPr>
+        <w:spacing w:after="55"/>
+      </w:pPr>
+      <w:r>
+        <w:rPr>
+          <w:rFonts w:ascii="Calibri" w:cs="Calibri" w:eastAsia="Calibri" w:hAnsi="Calibri"/>
+          <w:color w:val="333333"/>
+          <w:sz w:val="20"/>
+          <w:szCs w:val="20"/>
+        </w:rPr>
+        <w:t xml:space="preserve">Founder and full-stack developer of Roomly, a live multi-role SaaS platform for Nigerian university accommodation (Next.js, TypeScript, Express, Prisma, Supabase), including an escrow-backed payment workflow. Also built and tested a flash-loan arbitrage smart contract on a mainnet fork before deploying to Ethereum mainnet.</w:t>
+      </w:r>
+    </w:p>
+    <w:p>
+      <w:pPr>
+        <w:pBdr>
+          <w:bottom w:val="single" w:color="1F3864" w:sz="4" w:space="2"/>
+        </w:pBdr>
+        <w:spacing w:after="60" w:before="200"/>
+      </w:pPr>
+      <w:r>
+        <w:rPr>
+          <w:rFonts w:ascii="Calibri" w:cs="Calibri" w:eastAsia="Calibri" w:hAnsi="Calibri"/>
+          <w:b/>
+          <w:bCs/>
+          <w:color w:val="1F3864"/>
+          <w:sz w:val="21"/>
+          <w:szCs w:val="21"/>
+        </w:rPr>
         <w:t xml:space="preserve">SELECTED WRITING</w:t>
       </w:r>
     </w:p>
     <w:p>
       <w:pPr>
-        <w:spacing w:after="20" w:before="140"/>
+        <w:spacing w:after="20" w:before="130"/>
       </w:pPr>
       <w:r>
         <w:rPr>
@@ -677,19 +500,19 @@
           <w:sz w:val="20"/>
           <w:szCs w:val="20"/>
         </w:rPr>
-        <w:t xml:space="preserve">Product Copy</w:t>
-      </w:r>
-    </w:p>
-    <w:p>
-      <w:pPr>
-        <w:pStyle w:val="ListParagraph"/>
-        <w:numPr>
-          <w:ilvl w:val="0"/>
-          <w:numId w:val="2"/>
-        </w:numPr>
-        <w:spacing w:after="60"/>
-      </w:pPr>
-      <w:hyperlink w:history="1" r:id="rIdn6ixt2gtujvqlzpvho9oh">
+        <w:t xml:space="preserve">SEO Writing</w:t>
+      </w:r>
+    </w:p>
+    <w:p>
+      <w:pPr>
+        <w:pStyle w:val="ListParagraph"/>
+        <w:numPr>
+          <w:ilvl w:val="0"/>
+          <w:numId w:val="2"/>
+        </w:numPr>
+        <w:spacing w:after="55"/>
+      </w:pPr>
+      <w:hyperlink w:history="1" r:id="rIdmdpvhdrmfwvozjqf73sbc">
         <w:r>
           <w:rPr>
             <w:rFonts w:ascii="Calibri" w:cs="Calibri" w:eastAsia="Calibri" w:hAnsi="Calibri"/>
@@ -698,7 +521,7 @@
             <w:szCs w:val="20"/>
             <w:u w:val="single"/>
           </w:rPr>
-          <w:t xml:space="preserve">Roomly — Student Housing Platform</w:t>
+          <w:t xml:space="preserve">brightjasper.com SEO/GEO Case Study</w:t>
         </w:r>
       </w:hyperlink>
       <w:r>
@@ -708,19 +531,19 @@
           <w:sz w:val="20"/>
           <w:szCs w:val="20"/>
         </w:rPr>
-        <w:t xml:space="preserve"> — end-to-end platform copy for verified accommodation search, secure booking, and caretaker tools.</w:t>
-      </w:r>
-    </w:p>
-    <w:p>
-      <w:pPr>
-        <w:pStyle w:val="ListParagraph"/>
-        <w:numPr>
-          <w:ilvl w:val="0"/>
-          <w:numId w:val="2"/>
-        </w:numPr>
-        <w:spacing w:after="60"/>
-      </w:pPr>
-      <w:hyperlink w:history="1" r:id="rIdtbpdv8nagfjnunjxsl5bg">
+        <w:t xml:space="preserve"> — took the site from a 33% Ahrefs health score and zero Google indexing to 100% health and a Google AI Overview citation in 72 hours.</w:t>
+      </w:r>
+    </w:p>
+    <w:p>
+      <w:pPr>
+        <w:pStyle w:val="ListParagraph"/>
+        <w:numPr>
+          <w:ilvl w:val="0"/>
+          <w:numId w:val="2"/>
+        </w:numPr>
+        <w:spacing w:after="55"/>
+      </w:pPr>
+      <w:hyperlink w:history="1" r:id="rId8xgaxtskvzf6ero0znvt-">
         <w:r>
           <w:rPr>
             <w:rFonts w:ascii="Calibri" w:cs="Calibri" w:eastAsia="Calibri" w:hAnsi="Calibri"/>
@@ -729,7 +552,7 @@
             <w:szCs w:val="20"/>
             <w:u w:val="single"/>
           </w:rPr>
-          <w:t xml:space="preserve">Noel's Essentials — Product Copy</w:t>
+          <w:t xml:space="preserve">How I Fixed Ahrefs 3xx Redirects in Sitemap (www vs non-www on Cloudflare DNS + Vercel)</w:t>
         </w:r>
       </w:hyperlink>
       <w:r>
@@ -739,12 +562,43 @@
           <w:sz w:val="20"/>
           <w:szCs w:val="20"/>
         </w:rPr>
-        <w:t xml:space="preserve"> — product and storefront copy for a Nigerian natural-products brand.</w:t>
-      </w:r>
-    </w:p>
-    <w:p>
-      <w:pPr>
-        <w:spacing w:after="20" w:before="140"/>
+        <w:t xml:space="preserve"> — diagnosing and fixing a canonical loop across Cloudflare DNS and Vercel.</w:t>
+      </w:r>
+    </w:p>
+    <w:p>
+      <w:pPr>
+        <w:pStyle w:val="ListParagraph"/>
+        <w:numPr>
+          <w:ilvl w:val="0"/>
+          <w:numId w:val="2"/>
+        </w:numPr>
+        <w:spacing w:after="55"/>
+      </w:pPr>
+      <w:hyperlink w:history="1" r:id="rIdosb-qnpfsqzzoslpbxcsl">
+        <w:r>
+          <w:rPr>
+            <w:rFonts w:ascii="Calibri" w:cs="Calibri" w:eastAsia="Calibri" w:hAnsi="Calibri"/>
+            <w:color w:val="1155CC"/>
+            <w:sz w:val="20"/>
+            <w:szCs w:val="20"/>
+            <w:u w:val="single"/>
+          </w:rPr>
+          <w:t xml:space="preserve">How I Got a New Domain Indexed in 24 Hours</w:t>
+        </w:r>
+      </w:hyperlink>
+      <w:r>
+        <w:rPr>
+          <w:rFonts w:ascii="Calibri" w:cs="Calibri" w:eastAsia="Calibri" w:hAnsi="Calibri"/>
+          <w:color w:val="333333"/>
+          <w:sz w:val="20"/>
+          <w:szCs w:val="20"/>
+        </w:rPr>
+        <w:t xml:space="preserve"> — GSC live testing, sitemap submission, and indexing a brand-new domain.</w:t>
+      </w:r>
+    </w:p>
+    <w:p>
+      <w:pPr>
+        <w:spacing w:after="20" w:before="130"/>
       </w:pPr>
       <w:r>
         <w:rPr>
@@ -757,6 +611,86 @@
           <w:sz w:val="20"/>
           <w:szCs w:val="20"/>
         </w:rPr>
+        <w:t xml:space="preserve">Content Writing (Tech, Finance, Web3)</w:t>
+      </w:r>
+    </w:p>
+    <w:p>
+      <w:pPr>
+        <w:pStyle w:val="ListParagraph"/>
+        <w:numPr>
+          <w:ilvl w:val="0"/>
+          <w:numId w:val="2"/>
+        </w:numPr>
+        <w:spacing w:after="55"/>
+      </w:pPr>
+      <w:hyperlink w:history="1" r:id="rIdddc0xucmfqtozy8lbirrf">
+        <w:r>
+          <w:rPr>
+            <w:rFonts w:ascii="Calibri" w:cs="Calibri" w:eastAsia="Calibri" w:hAnsi="Calibri"/>
+            <w:color w:val="1155CC"/>
+            <w:sz w:val="20"/>
+            <w:szCs w:val="20"/>
+            <w:u w:val="single"/>
+          </w:rPr>
+          <w:t xml:space="preserve">Dangote Refinery Stock: Why ₦10,000 Is Unrealistic</w:t>
+        </w:r>
+      </w:hyperlink>
+      <w:r>
+        <w:rPr>
+          <w:rFonts w:ascii="Calibri" w:cs="Calibri" w:eastAsia="Calibri" w:hAnsi="Calibri"/>
+          <w:color w:val="333333"/>
+          <w:sz w:val="20"/>
+          <w:szCs w:val="20"/>
+        </w:rPr>
+        <w:t xml:space="preserve"> — research-driven breakdown fact-checked against the IPO prospectus and primary financial sources.</w:t>
+      </w:r>
+    </w:p>
+    <w:p>
+      <w:pPr>
+        <w:pStyle w:val="ListParagraph"/>
+        <w:numPr>
+          <w:ilvl w:val="0"/>
+          <w:numId w:val="2"/>
+        </w:numPr>
+        <w:spacing w:after="55"/>
+      </w:pPr>
+      <w:hyperlink w:history="1" r:id="rId5obfsslrclf1g7fnpdtzd">
+        <w:r>
+          <w:rPr>
+            <w:rFonts w:ascii="Calibri" w:cs="Calibri" w:eastAsia="Calibri" w:hAnsi="Calibri"/>
+            <w:color w:val="1155CC"/>
+            <w:sz w:val="20"/>
+            <w:szCs w:val="20"/>
+            <w:u w:val="single"/>
+          </w:rPr>
+          <w:t xml:space="preserve">Recursive zk-SNARKs: How Mina Keeps Its Blockchain Succinct</w:t>
+        </w:r>
+      </w:hyperlink>
+      <w:r>
+        <w:rPr>
+          <w:rFonts w:ascii="Calibri" w:cs="Calibri" w:eastAsia="Calibri" w:hAnsi="Calibri"/>
+          <w:color w:val="333333"/>
+          <w:sz w:val="20"/>
+          <w:szCs w:val="20"/>
+        </w:rPr>
+        <w:t xml:space="preserve"> — part of a technical deep-dive series on Mina Protocol's zero-knowledge architecture, sourced against Mina's own documentation and primary cryptography papers.</w:t>
+      </w:r>
+    </w:p>
+    <w:p>
+      <w:pPr>
+        <w:spacing w:after="20" w:before="130"/>
+      </w:pPr>
+      <w:r>
+        <w:rPr>
+          <w:rFonts w:ascii="Calibri" w:cs="Calibri" w:eastAsia="Calibri" w:hAnsi="Calibri"/>
+          <w:b/>
+          <w:bCs/>
+          <w:i/>
+          <w:iCs/>
+          <w:color w:val="333333"/>
+          <w:sz w:val="20"/>
+          <w:szCs w:val="20"/>
+        </w:rPr>
         <w:t xml:space="preserve">Technical Writing</w:t>
       </w:r>
     </w:p>
@@ -767,9 +701,9 @@
           <w:ilvl w:val="0"/>
           <w:numId w:val="2"/>
         </w:numPr>
-        <w:spacing w:after="60"/>
-      </w:pPr>
-      <w:hyperlink w:history="1" r:id="rIdot4ej2prdndwlewope48u">
+        <w:spacing w:after="55"/>
+      </w:pPr>
+      <w:hyperlink w:history="1" r:id="rIdnzscfjadky74r8jqhqobk">
         <w:r>
           <w:rPr>
             <w:rFonts w:ascii="Calibri" w:cs="Calibri" w:eastAsia="Calibri" w:hAnsi="Calibri"/>
@@ -798,9 +732,9 @@
           <w:ilvl w:val="0"/>
           <w:numId w:val="2"/>
         </w:numPr>
-        <w:spacing w:after="60"/>
-      </w:pPr>
-      <w:hyperlink w:history="1" r:id="rIdmtfj1lyyd2aotuqjxnuhj">
+        <w:spacing w:after="55"/>
+      </w:pPr>
+      <w:hyperlink w:history="1" r:id="rIdb_critkus1hv6il81ubwy">
         <w:r>
           <w:rPr>
             <w:rFonts w:ascii="Calibri" w:cs="Calibri" w:eastAsia="Calibri" w:hAnsi="Calibri"/>
@@ -824,14 +758,41 @@
     </w:p>
     <w:p>
       <w:pPr>
-        <w:pStyle w:val="ListParagraph"/>
-        <w:numPr>
-          <w:ilvl w:val="0"/>
-          <w:numId w:val="2"/>
-        </w:numPr>
-        <w:spacing w:after="60"/>
-      </w:pPr>
-      <w:hyperlink w:history="1" r:id="rIdwbfrvclaqdfwrjjxdpg1e">
+        <w:spacing w:after="20" w:before="130"/>
+      </w:pPr>
+      <w:r>
+        <w:rPr>
+          <w:rFonts w:ascii="Calibri" w:cs="Calibri" w:eastAsia="Calibri" w:hAnsi="Calibri"/>
+          <w:b/>
+          <w:bCs/>
+          <w:i/>
+          <w:iCs/>
+          <w:color w:val="333333"/>
+          <w:sz w:val="20"/>
+          <w:szCs w:val="20"/>
+        </w:rPr>
+        <w:t xml:space="preserve">Archived — Product &amp; Persuasive Writing (past work, not actively pitched)</w:t>
+      </w:r>
+    </w:p>
+    <w:p>
+      <w:pPr>
+        <w:pStyle w:val="ListParagraph"/>
+        <w:numPr>
+          <w:ilvl w:val="0"/>
+          <w:numId w:val="2"/>
+        </w:numPr>
+        <w:spacing w:after="55"/>
+      </w:pPr>
+      <w:r>
+        <w:rPr>
+          <w:rFonts w:ascii="Calibri" w:cs="Calibri" w:eastAsia="Calibri" w:hAnsi="Calibri"/>
+          <w:color w:val="333333"/>
+          <w:sz w:val="20"/>
+          <w:szCs w:val="20"/>
+        </w:rPr>
+        <w:t xml:space="preserve">Roomly product copy, Noel's Essentials product copy, Roomly founder story — full samples at </w:t>
+      </w:r>
+      <w:hyperlink w:history="1" r:id="rIdvgf8kkiy9jx1kb8xpd2kk">
         <w:r>
           <w:rPr>
             <w:rFonts w:ascii="Calibri" w:cs="Calibri" w:eastAsia="Calibri" w:hAnsi="Calibri"/>
@@ -840,74 +801,16 @@
             <w:szCs w:val="20"/>
             <w:u w:val="single"/>
           </w:rPr>
-          <w:t xml:space="preserve">Dangote Refinery Stock: Why ₦10,000 Is Unrealistic</w:t>
+          <w:t xml:space="preserve">brightjasper.com/writing-samples</w:t>
         </w:r>
       </w:hyperlink>
-      <w:r>
-        <w:rPr>
-          <w:rFonts w:ascii="Calibri" w:cs="Calibri" w:eastAsia="Calibri" w:hAnsi="Calibri"/>
-          <w:color w:val="333333"/>
-          <w:sz w:val="20"/>
-          <w:szCs w:val="20"/>
-        </w:rPr>
-        <w:t xml:space="preserve"> — research-driven breakdown fact-checked against the IPO prospectus and primary financial sources.</w:t>
-      </w:r>
-    </w:p>
-    <w:p>
-      <w:pPr>
-        <w:spacing w:after="20" w:before="140"/>
-      </w:pPr>
-      <w:r>
-        <w:rPr>
-          <w:rFonts w:ascii="Calibri" w:cs="Calibri" w:eastAsia="Calibri" w:hAnsi="Calibri"/>
-          <w:b/>
-          <w:bCs/>
-          <w:i/>
-          <w:iCs/>
-          <w:color w:val="333333"/>
-          <w:sz w:val="20"/>
-          <w:szCs w:val="20"/>
-        </w:rPr>
-        <w:t xml:space="preserve">Persuasive Writing</w:t>
-      </w:r>
-    </w:p>
-    <w:p>
-      <w:pPr>
-        <w:pStyle w:val="ListParagraph"/>
-        <w:numPr>
-          <w:ilvl w:val="0"/>
-          <w:numId w:val="2"/>
-        </w:numPr>
-        <w:spacing w:after="60"/>
-      </w:pPr>
-      <w:hyperlink w:history="1" r:id="rIdzhsrya28nbry-vyidwqst">
-        <w:r>
-          <w:rPr>
-            <w:rFonts w:ascii="Calibri" w:cs="Calibri" w:eastAsia="Calibri" w:hAnsi="Calibri"/>
-            <w:color w:val="1155CC"/>
-            <w:sz w:val="20"/>
-            <w:szCs w:val="20"/>
-            <w:u w:val="single"/>
-          </w:rPr>
-          <w:t xml:space="preserve">Roomly Founder Story — Why I Built It</w:t>
-        </w:r>
-      </w:hyperlink>
-      <w:r>
-        <w:rPr>
-          <w:rFonts w:ascii="Calibri" w:cs="Calibri" w:eastAsia="Calibri" w:hAnsi="Calibri"/>
-          <w:color w:val="333333"/>
-          <w:sz w:val="20"/>
-          <w:szCs w:val="20"/>
-        </w:rPr>
-        <w:t xml:space="preserve"> — first-person founder narrative on building Roomly after being scammed and overcharged searching for student housing.</w:t>
-      </w:r>
     </w:p>
     <w:p>
       <w:pPr>
         <w:pBdr>
           <w:bottom w:val="single" w:color="1F3864" w:sz="4" w:space="2"/>
         </w:pBdr>
-        <w:spacing w:after="60" w:before="220"/>
+        <w:spacing w:after="60" w:before="200"/>
       </w:pPr>
       <w:r>
         <w:rPr>
@@ -923,7 +826,7 @@
     </w:p>
     <w:p>
       <w:pPr>
-        <w:spacing w:after="20" w:before="100"/>
+        <w:spacing w:after="20" w:before="80"/>
       </w:pPr>
       <w:r>
         <w:rPr>
@@ -955,7 +858,7 @@
           <w:ilvl w:val="0"/>
           <w:numId w:val="2"/>
         </w:numPr>
-        <w:spacing w:after="60"/>
+        <w:spacing w:after="55"/>
       </w:pPr>
       <w:r>
         <w:rPr>
@@ -972,7 +875,7 @@
         <w:pBdr>
           <w:bottom w:val="single" w:color="1F3864" w:sz="4" w:space="2"/>
         </w:pBdr>
-        <w:spacing w:after="60" w:before="220"/>
+        <w:spacing w:after="60" w:before="200"/>
       </w:pPr>
       <w:r>
         <w:rPr>
@@ -993,7 +896,26 @@
           <w:ilvl w:val="0"/>
           <w:numId w:val="2"/>
         </w:numPr>
-        <w:spacing w:after="60"/>
+        <w:spacing w:after="55"/>
+      </w:pPr>
+      <w:r>
+        <w:rPr>
+          <w:rFonts w:ascii="Calibri" w:cs="Calibri" w:eastAsia="Calibri" w:hAnsi="Calibri"/>
+          <w:color w:val="333333"/>
+          <w:sz w:val="20"/>
+          <w:szCs w:val="20"/>
+        </w:rPr>
+        <w:t xml:space="preserve">Google SEO Starter Guide</w:t>
+      </w:r>
+    </w:p>
+    <w:p>
+      <w:pPr>
+        <w:pStyle w:val="ListParagraph"/>
+        <w:numPr>
+          <w:ilvl w:val="0"/>
+          <w:numId w:val="2"/>
+        </w:numPr>
+        <w:spacing w:after="55"/>
       </w:pPr>
       <w:r>
         <w:rPr>
@@ -1007,7 +929,7 @@
     </w:p>
     <w:sectPr>
       <w:pgSz w:w="12240" w:h="15840" w:orient="portrait"/>
-      <w:pgMar w:top="720" w:right="900" w:bottom="720" w:left="900" w:header="708" w:footer="708" w:gutter="0"/>
+      <w:pgMar w:top="700" w:right="880" w:bottom="700" w:left="880" w:header="708" w:footer="708" w:gutter="0"/>
       <w:pgNumType/>
       <w:docGrid w:linePitch="360"/>
     </w:sectPr>

</xml_diff>